<commit_message>
Rebuild the website with the new recovery times
Co-Authored-By: Claude Opus 5.5 <noreply@anthropic.com>
Claude-Session: https://claude.ai/code/session_015SADCFzhKijkC2foUmXrpC
</commit_message>
<xml_diff>
--- a/legend-dynamics/site/aurora/Aurora_Players_Guide.docx
+++ b/legend-dynamics/site/aurora/Aurora_Players_Guide.docx
@@ -11154,23 +11154,175 @@
         <w:pStyle w:val="FirstParagraph"/>
       </w:pPr>
       <w:r>
-        <w:t xml:space="preserve">Each</w:t>
-      </w:r>
-      <w:r>
-        <w:t xml:space="preserve"> </w:t>
-      </w:r>
-      <w:r>
-        <w:rPr>
-          <w:bCs/>
-          <w:b/>
-        </w:rPr>
-        <w:t xml:space="preserve">full day</w:t>
-      </w:r>
-      <w:r>
-        <w:t xml:space="preserve"> </w:t>
-      </w:r>
-      <w:r>
-        <w:t xml:space="preserve">of rest clears one injury box. Rest means nothing strenuous. At three boxes, rest alone clears nothing: treatment must clear the first box.</w:t>
+        <w:t xml:space="preserve">Rest clears injury one box at a time, and the worse you’re hurt, the longer each box takes. Rest means nothing strenuous: no fighting, no hard travel, no long days of work.</w:t>
+      </w:r>
+    </w:p>
+    <w:tbl>
+      <w:tblPr>
+        <w:tblStyle w:val="Table"/>
+        <w:tblW w:type="auto" w:w="0"/>
+        <w:tblLook w:firstRow="1" w:lastRow="0" w:firstColumn="0" w:lastColumn="0" w:noHBand="0" w:noVBand="0" w:val="0020"/>
+        <w:jc w:val="start"/>
+        <w:tblBorders>
+          <w:top w:val="single" w:sz="4" w:color="B8C2D3"/>
+          <w:left w:val="single" w:sz="4" w:color="B8C2D3"/>
+          <w:bottom w:val="single" w:sz="4" w:color="B8C2D3"/>
+          <w:right w:val="single" w:sz="4" w:color="B8C2D3"/>
+          <w:insideH w:val="single" w:sz="4" w:color="B8C2D3"/>
+          <w:insideV w:val="single" w:sz="4" w:color="B8C2D3"/>
+        </w:tblBorders>
+      </w:tblPr>
+      <w:tblGrid>
+        <w:gridCol w:w="3960"/>
+        <w:gridCol w:w="3960"/>
+      </w:tblGrid>
+      <w:tr>
+        <w:trPr>
+          <w:tblHeader w:val="true"/>
+        </w:trPr>
+        <w:tc>
+          <w:tcPr>
+            <w:shd w:val="clear" w:fill="E8EEF8"/>
+          </w:tcPr>
+          <w:p>
+            <w:pPr>
+              <w:pStyle w:val="Compact"/>
+              <w:jc w:val="left"/>
+            </w:pPr>
+            <w:r>
+              <w:rPr>
+                <w:b/>
+                <w:sz w:val="19"/>
+              </w:rPr>
+              <w:t xml:space="preserve">Boxes marked</w:t>
+            </w:r>
+          </w:p>
+        </w:tc>
+        <w:tc>
+          <w:tcPr>
+            <w:shd w:val="clear" w:fill="E8EEF8"/>
+          </w:tcPr>
+          <w:p>
+            <w:pPr>
+              <w:pStyle w:val="Compact"/>
+              <w:jc w:val="left"/>
+            </w:pPr>
+            <w:r>
+              <w:rPr>
+                <w:b/>
+                <w:sz w:val="19"/>
+              </w:rPr>
+              <w:t xml:space="preserve">Rest to clear one box</w:t>
+            </w:r>
+          </w:p>
+        </w:tc>
+      </w:tr>
+      <w:tr>
+        <w:tc>
+          <w:tcPr/>
+          <w:p>
+            <w:pPr>
+              <w:pStyle w:val="Compact"/>
+              <w:jc w:val="left"/>
+            </w:pPr>
+            <w:r>
+              <w:rPr>
+                <w:b/>
+                <w:sz w:val="19"/>
+              </w:rPr>
+              <w:t xml:space="preserve">1</w:t>
+            </w:r>
+          </w:p>
+        </w:tc>
+        <w:tc>
+          <w:tcPr/>
+          <w:p>
+            <w:pPr>
+              <w:pStyle w:val="Compact"/>
+              <w:jc w:val="left"/>
+            </w:pPr>
+            <w:r>
+              <w:rPr>
+                <w:sz w:val="19"/>
+              </w:rPr>
+              <w:t xml:space="preserve">A full day</w:t>
+            </w:r>
+          </w:p>
+        </w:tc>
+      </w:tr>
+      <w:tr>
+        <w:tc>
+          <w:tcPr/>
+          <w:p>
+            <w:pPr>
+              <w:pStyle w:val="Compact"/>
+              <w:jc w:val="left"/>
+            </w:pPr>
+            <w:r>
+              <w:rPr>
+                <w:b/>
+                <w:sz w:val="19"/>
+              </w:rPr>
+              <w:t xml:space="preserve">2</w:t>
+            </w:r>
+          </w:p>
+        </w:tc>
+        <w:tc>
+          <w:tcPr/>
+          <w:p>
+            <w:pPr>
+              <w:pStyle w:val="Compact"/>
+              <w:jc w:val="left"/>
+            </w:pPr>
+            <w:r>
+              <w:rPr>
+                <w:sz w:val="19"/>
+              </w:rPr>
+              <w:t xml:space="preserve">At least three days</w:t>
+            </w:r>
+          </w:p>
+        </w:tc>
+      </w:tr>
+      <w:tr>
+        <w:tc>
+          <w:tcPr/>
+          <w:p>
+            <w:pPr>
+              <w:pStyle w:val="Compact"/>
+              <w:jc w:val="left"/>
+            </w:pPr>
+            <w:r>
+              <w:rPr>
+                <w:b/>
+                <w:sz w:val="19"/>
+              </w:rPr>
+              <w:t xml:space="preserve">3</w:t>
+            </w:r>
+          </w:p>
+        </w:tc>
+        <w:tc>
+          <w:tcPr/>
+          <w:p>
+            <w:pPr>
+              <w:pStyle w:val="Compact"/>
+              <w:jc w:val="left"/>
+            </w:pPr>
+            <w:r>
+              <w:rPr>
+                <w:sz w:val="19"/>
+              </w:rPr>
+              <w:t xml:space="preserve">A week, and only in someone’s care</w:t>
+            </w:r>
+          </w:p>
+        </w:tc>
+      </w:tr>
+    </w:tbl>
+    <w:p>
+      <w:pPr>
+        <w:pStyle w:val="BodyText"/>
+      </w:pPr>
+      <w:r>
+        <w:t xml:space="preserve">At three boxes, rest alone does nothing until someone has stabilized or treated you; after that, a week of rest in their care clears the first box. A successful treatment is faster. The times add up: from three boxes, rest alone takes about a week and a half to heal completely (a week, then three days, then a day).</w:t>
       </w:r>
     </w:p>
     <w:bookmarkEnd w:id="62"/>
@@ -41586,7 +41738,7 @@
         <w:t xml:space="preserve"> </w:t>
       </w:r>
       <w:r>
-        <w:t xml:space="preserve">stabilize in one action. Field care clears 1 box (2 on margin 5+). Proper care gives +2 and clears 2 (3 on margin 5+). Rest: one box per full day, not from three.</w:t>
+        <w:t xml:space="preserve">stabilize in one action. Field care clears 1 box (2 on margin 5+). Proper care gives +2 and clears 2 (3 on margin 5+). Rest clears a box in a day at 1 box, three days at 2, a week at 3 (in someone’s care).</w:t>
       </w:r>
     </w:p>
     <w:p>

</xml_diff>

<commit_message>
Rebuild the website with the Encounter panel
Co-Authored-By: Claude Opus 5.5 <noreply@anthropic.com>
Claude-Session: https://claude.ai/code/session_015SADCFzhKijkC2foUmXrpC
</commit_message>
<xml_diff>
--- a/legend-dynamics/site/aurora/Aurora_Players_Guide.docx
+++ b/legend-dynamics/site/aurora/Aurora_Players_Guide.docx
@@ -7669,7 +7669,7 @@
     </w:p>
     <w:bookmarkEnd w:id="48"/>
     <w:bookmarkEnd w:id="49"/>
-    <w:bookmarkStart w:id="60" w:name="personal-combat"/>
+    <w:bookmarkStart w:id="61" w:name="personal-combat"/>
     <w:p>
       <w:pPr>
         <w:pStyle w:val="Heading1"/>
@@ -11971,8 +11971,42 @@
       </w:r>
     </w:p>
     <w:bookmarkEnd w:id="59"/>
+    <w:bookmarkStart w:id="60" w:name="the-encounter-panel"/>
+    <w:p>
+      <w:pPr>
+        <w:pStyle w:val="Heading2"/>
+      </w:pPr>
+      <w:r>
+        <w:t xml:space="preserve">The Encounter panel</w:t>
+      </w:r>
+    </w:p>
+    <w:p>
+      <w:pPr>
+        <w:pStyle w:val="FirstParagraph"/>
+      </w:pPr>
+      <w:r>
+        <w:t xml:space="preserve">The GM view also has an</w:t>
+      </w:r>
+      <w:r>
+        <w:t xml:space="preserve"> </w:t>
+      </w:r>
+      <w:r>
+        <w:rPr>
+          <w:bCs/>
+          <w:b/>
+        </w:rPr>
+        <w:t xml:space="preserve">Encounter</w:t>
+      </w:r>
+      <w:r>
+        <w:t xml:space="preserve"> </w:t>
+      </w:r>
+      <w:r>
+        <w:t xml:space="preserve">panel that runs a fight by these rules and shows every roll. Add characters from the GM view and opponents from the Threats table (or make one up on the spot), then start: it keeps the turn order by Agility, and for each attack works out the range, the defense (Dodge, Parry or Block, one a round), the boxes marked and any telling hit, offering a Spark point choices at the moment they apply. Hits land on the character cards and the battle map, and with gritty combat on, grievous wounds are rolled and kept. The panel keeps a log and a summary of the fight, which can be saved to a file. It’s a helper, not a rule: the GM can rule any result differently, and the log says so.</w:t>
+      </w:r>
+    </w:p>
     <w:bookmarkEnd w:id="60"/>
-    <w:bookmarkStart w:id="65" w:name="medical-care"/>
+    <w:bookmarkEnd w:id="61"/>
+    <w:bookmarkStart w:id="66" w:name="medical-care"/>
     <w:p>
       <w:pPr>
         <w:pStyle w:val="Heading1"/>
@@ -12018,7 +12052,7 @@
         <w:t xml:space="preserve">).</w:t>
       </w:r>
     </w:p>
-    <w:bookmarkStart w:id="61" w:name="diagnosis-and-stabilization"/>
+    <w:bookmarkStart w:id="62" w:name="diagnosis-and-stabilization"/>
     <w:p>
       <w:pPr>
         <w:pStyle w:val="Heading2"/>
@@ -12035,8 +12069,8 @@
         <w:t xml:space="preserve">Roll Medicine when the diagnosis is uncertain or an urgent treatment decision matters. Emergency stabilization takes one action and a successful Medicine roll with a first-aid kit. It ends Dying and stops deterioration, but removes no boxes.</w:t>
       </w:r>
     </w:p>
-    <w:bookmarkEnd w:id="61"/>
-    <w:bookmarkStart w:id="62" w:name="field-treatment"/>
+    <w:bookmarkEnd w:id="62"/>
+    <w:bookmarkStart w:id="63" w:name="field-treatment"/>
     <w:p>
       <w:pPr>
         <w:pStyle w:val="Heading2"/>
@@ -12053,8 +12087,8 @@
         <w:t xml:space="preserve">With a first-aid kit and several uninterrupted minutes, successful Medicine removes one injury box; success by 5 or more removes two. Each injury receives one field-treatment attempt; further attempts need changed circumstances.</w:t>
       </w:r>
     </w:p>
-    <w:bookmarkEnd w:id="62"/>
-    <w:bookmarkStart w:id="63" w:name="proper-care"/>
+    <w:bookmarkEnd w:id="63"/>
+    <w:bookmarkStart w:id="64" w:name="proper-care"/>
     <w:p>
       <w:pPr>
         <w:pStyle w:val="Heading2"/>
@@ -12071,8 +12105,8 @@
         <w:t xml:space="preserve">A hospital with an Operant ward grants +2 to Medicine. A successful treatment removes two boxes; success by 5 or more removes three. Allow the time the treatment requires.</w:t>
       </w:r>
     </w:p>
-    <w:bookmarkEnd w:id="63"/>
-    <w:bookmarkStart w:id="64" w:name="natural-recovery"/>
+    <w:bookmarkEnd w:id="64"/>
+    <w:bookmarkStart w:id="65" w:name="natural-recovery"/>
     <w:p>
       <w:pPr>
         <w:pStyle w:val="Heading2"/>
@@ -12257,9 +12291,9 @@
         <w:t xml:space="preserve">At three boxes, rest alone does nothing until someone has stabilized or treated you; after that, a week of rest in their care clears the first box. A successful treatment is faster. The times add up: from three boxes, rest alone takes about a week and a half to heal completely (a week, then three days, then a day).</w:t>
       </w:r>
     </w:p>
-    <w:bookmarkEnd w:id="64"/>
     <w:bookmarkEnd w:id="65"/>
-    <w:bookmarkStart w:id="70" w:name="magic"/>
+    <w:bookmarkEnd w:id="66"/>
+    <w:bookmarkStart w:id="71" w:name="magic"/>
     <w:p>
       <w:pPr>
         <w:pStyle w:val="Heading1"/>
@@ -12503,7 +12537,7 @@
         </w:tc>
       </w:tr>
     </w:tbl>
-    <w:bookmarkStart w:id="66" w:name="cantrips"/>
+    <w:bookmarkStart w:id="67" w:name="cantrips"/>
     <w:p>
       <w:pPr>
         <w:pStyle w:val="Heading2"/>
@@ -12884,8 +12918,8 @@
         <w:t xml:space="preserve">A failed cantrip marks a box of Strain; a natural 18 marks two, or something answers that shouldn’t.</w:t>
       </w:r>
     </w:p>
-    <w:bookmarkEnd w:id="66"/>
-    <w:bookmarkStart w:id="67" w:name="rituals"/>
+    <w:bookmarkEnd w:id="67"/>
+    <w:bookmarkStart w:id="68" w:name="rituals"/>
     <w:p>
       <w:pPr>
         <w:pStyle w:val="Heading2"/>
@@ -13202,8 +13236,8 @@
         <w:t xml:space="preserve">The right materials, hour or place remove one segment.</w:t>
       </w:r>
     </w:p>
-    <w:bookmarkEnd w:id="67"/>
-    <w:bookmarkStart w:id="68" w:name="fetishes"/>
+    <w:bookmarkEnd w:id="68"/>
+    <w:bookmarkStart w:id="69" w:name="fetishes"/>
     <w:p>
       <w:pPr>
         <w:pStyle w:val="Heading2"/>
@@ -13236,8 +13270,8 @@
         <w:t xml:space="preserve">ready fetish, two with Powers as an Expert skill. Preparation is how slow magic wins a fast fight.</w:t>
       </w:r>
     </w:p>
-    <w:bookmarkEnd w:id="68"/>
-    <w:bookmarkStart w:id="69" w:name="magic-in-aurora"/>
+    <w:bookmarkEnd w:id="69"/>
+    <w:bookmarkStart w:id="70" w:name="magic-in-aurora"/>
     <w:p>
       <w:pPr>
         <w:pStyle w:val="Heading2"/>
@@ -13503,9 +13537,9 @@
         </w:tc>
       </w:tr>
     </w:tbl>
-    <w:bookmarkEnd w:id="69"/>
     <w:bookmarkEnd w:id="70"/>
-    <w:bookmarkStart w:id="74" w:name="spark-points-and-tracks"/>
+    <w:bookmarkEnd w:id="71"/>
+    <w:bookmarkStart w:id="75" w:name="spark-points-and-tracks"/>
     <w:p>
       <w:pPr>
         <w:pStyle w:val="Heading1"/>
@@ -13514,7 +13548,7 @@
         <w:t xml:space="preserve">Spark points and tracks</w:t>
       </w:r>
     </w:p>
-    <w:bookmarkStart w:id="71" w:name="using-spark-points"/>
+    <w:bookmarkStart w:id="72" w:name="using-spark-points"/>
     <w:p>
       <w:pPr>
         <w:pStyle w:val="Heading2"/>
@@ -13732,8 +13766,8 @@
         <w:t xml:space="preserve">Gain one point when one of your complications creates a meaningful problem you accept, including a companion complication. You can decline the proposed complication without penalty.</w:t>
       </w:r>
     </w:p>
-    <w:bookmarkEnd w:id="71"/>
-    <w:bookmarkStart w:id="72" w:name="collateral-scrutiny-and-backlash"/>
+    <w:bookmarkEnd w:id="72"/>
+    <w:bookmarkStart w:id="73" w:name="collateral-scrutiny-and-backlash"/>
     <w:p>
       <w:pPr>
         <w:pStyle w:val="Heading2"/>
@@ -14100,8 +14134,8 @@
         </w:tc>
       </w:tr>
     </w:tbl>
-    <w:bookmarkEnd w:id="72"/>
-    <w:bookmarkStart w:id="73" w:name="advancement"/>
+    <w:bookmarkEnd w:id="73"/>
+    <w:bookmarkStart w:id="74" w:name="advancement"/>
     <w:p>
       <w:pPr>
         <w:pStyle w:val="Heading2"/>
@@ -14545,9 +14579,9 @@
         <w:t xml:space="preserve">Magic and powers grow the same way, at the costs their chapters give.</w:t>
       </w:r>
     </w:p>
-    <w:bookmarkEnd w:id="73"/>
     <w:bookmarkEnd w:id="74"/>
-    <w:bookmarkStart w:id="77" w:name="running-cases"/>
+    <w:bookmarkEnd w:id="75"/>
+    <w:bookmarkStart w:id="78" w:name="running-cases"/>
     <w:p>
       <w:pPr>
         <w:pStyle w:val="Heading1"/>
@@ -14556,7 +14590,7 @@
         <w:t xml:space="preserve">Running cases</w:t>
       </w:r>
     </w:p>
-    <w:bookmarkStart w:id="75" w:name="case-seeds"/>
+    <w:bookmarkStart w:id="76" w:name="case-seeds"/>
     <w:p>
       <w:pPr>
         <w:pStyle w:val="Heading2"/>
@@ -16788,8 +16822,8 @@
         </w:tc>
       </w:tr>
     </w:tbl>
-    <w:bookmarkEnd w:id="75"/>
-    <w:bookmarkStart w:id="76" w:name="the-case-files"/>
+    <w:bookmarkEnd w:id="76"/>
+    <w:bookmarkStart w:id="77" w:name="the-case-files"/>
     <w:p>
       <w:pPr>
         <w:pStyle w:val="Heading2"/>
@@ -16916,9 +16950,9 @@
         <w:t xml:space="preserve">After a significant case, each character earns 1 advancement point; at a milestone, 2 more.</w:t>
       </w:r>
     </w:p>
-    <w:bookmarkEnd w:id="76"/>
     <w:bookmarkEnd w:id="77"/>
-    <w:bookmarkStart w:id="85" w:name="the-world-of-aurora"/>
+    <w:bookmarkEnd w:id="78"/>
+    <w:bookmarkStart w:id="86" w:name="the-world-of-aurora"/>
     <w:p>
       <w:pPr>
         <w:pStyle w:val="Heading1"/>
@@ -16927,7 +16961,7 @@
         <w:t xml:space="preserve">The world of Aurora</w:t>
       </w:r>
     </w:p>
-    <w:bookmarkStart w:id="78" w:name="the-first-wave"/>
+    <w:bookmarkStart w:id="79" w:name="the-first-wave"/>
     <w:p>
       <w:pPr>
         <w:pStyle w:val="Heading2"/>
@@ -17162,8 +17196,8 @@
         <w:t xml:space="preserve">fought for the Allies and destroyed the first Steel Falcon.</w:t>
       </w:r>
     </w:p>
-    <w:bookmarkEnd w:id="78"/>
-    <w:bookmarkStart w:id="79" w:name="the-public-years"/>
+    <w:bookmarkEnd w:id="79"/>
+    <w:bookmarkStart w:id="80" w:name="the-public-years"/>
     <w:p>
       <w:pPr>
         <w:pStyle w:val="Heading2"/>
@@ -17417,8 +17451,8 @@
         <w:t xml:space="preserve">.</w:t>
       </w:r>
     </w:p>
-    <w:bookmarkEnd w:id="79"/>
-    <w:bookmarkStart w:id="80" w:name="exlaw"/>
+    <w:bookmarkEnd w:id="80"/>
+    <w:bookmarkStart w:id="81" w:name="exlaw"/>
     <w:p>
       <w:pPr>
         <w:pStyle w:val="Heading2"/>
@@ -17738,8 +17772,8 @@
         <w:t xml:space="preserve">.</w:t>
       </w:r>
     </w:p>
-    <w:bookmarkEnd w:id="80"/>
-    <w:bookmarkStart w:id="81" w:name="the-second-wave"/>
+    <w:bookmarkEnd w:id="81"/>
+    <w:bookmarkStart w:id="82" w:name="the-second-wave"/>
     <w:p>
       <w:pPr>
         <w:pStyle w:val="Heading2"/>
@@ -17972,8 +18006,8 @@
         <w:t xml:space="preserve">opened its Operant division, pooling the police of the US, the Commonwealth of Independent States, Britain, China and many others against terrorism and Operant crime.</w:t>
       </w:r>
     </w:p>
-    <w:bookmarkEnd w:id="81"/>
-    <w:bookmarkStart w:id="82" w:name="a-new-century"/>
+    <w:bookmarkEnd w:id="82"/>
+    <w:bookmarkStart w:id="83" w:name="a-new-century"/>
     <w:p>
       <w:pPr>
         <w:pStyle w:val="Heading2"/>
@@ -18278,8 +18312,8 @@
         <w:t xml:space="preserve">took office.</w:t>
       </w:r>
     </w:p>
-    <w:bookmarkEnd w:id="82"/>
-    <w:bookmarkStart w:id="83" w:name="the-umkas-invasion"/>
+    <w:bookmarkEnd w:id="83"/>
+    <w:bookmarkStart w:id="84" w:name="the-umkas-invasion"/>
     <w:p>
       <w:pPr>
         <w:pStyle w:val="Heading2"/>
@@ -18711,8 +18745,8 @@
         <w:t xml:space="preserve">The Atomic Man found a grey hair. Federal attempts to stop the march to the Haven brought standoff after standoff; Celerity intervened at every one, and a federal warrant was issued for her arrest.</w:t>
       </w:r>
     </w:p>
-    <w:bookmarkEnd w:id="83"/>
-    <w:bookmarkStart w:id="84" w:name="section"/>
+    <w:bookmarkEnd w:id="84"/>
+    <w:bookmarkStart w:id="85" w:name="section"/>
     <w:p>
       <w:pPr>
         <w:pStyle w:val="Heading2"/>
@@ -18742,9 +18776,9 @@
         <w:t xml:space="preserve">, is expanding through Korea under Hyun Wang. And in a pocket dimension no one has found, Director Humbacht’s other prison is filling up.</w:t>
       </w:r>
     </w:p>
-    <w:bookmarkEnd w:id="84"/>
     <w:bookmarkEnd w:id="85"/>
-    <w:bookmarkStart w:id="90" w:name="the-law"/>
+    <w:bookmarkEnd w:id="86"/>
+    <w:bookmarkStart w:id="91" w:name="the-law"/>
     <w:p>
       <w:pPr>
         <w:pStyle w:val="Heading1"/>
@@ -18753,7 +18787,7 @@
         <w:t xml:space="preserve">The law</w:t>
       </w:r>
     </w:p>
-    <w:bookmarkStart w:id="86" w:name="the-extraordinary-powers-act"/>
+    <w:bookmarkStart w:id="87" w:name="the-extraordinary-powers-act"/>
     <w:p>
       <w:pPr>
         <w:pStyle w:val="Heading2"/>
@@ -18817,8 +18851,8 @@
         <w:t xml:space="preserve">became the official term). Registered Operants may use their powers in self-defense and emergencies; using powers in public otherwise, or being an unregistered Operant, is a federal crime.</w:t>
       </w:r>
     </w:p>
-    <w:bookmarkEnd w:id="86"/>
-    <w:bookmarkStart w:id="87" w:name="emd-classifications"/>
+    <w:bookmarkEnd w:id="87"/>
+    <w:bookmarkStart w:id="88" w:name="emd-classifications"/>
     <w:p>
       <w:pPr>
         <w:pStyle w:val="Heading2"/>
@@ -19216,8 +19250,8 @@
         </w:tc>
       </w:tr>
     </w:tbl>
-    <w:bookmarkEnd w:id="87"/>
-    <w:bookmarkStart w:id="88" w:name="legal-status"/>
+    <w:bookmarkEnd w:id="88"/>
+    <w:bookmarkStart w:id="89" w:name="legal-status"/>
     <w:p>
       <w:pPr>
         <w:pStyle w:val="Heading2"/>
@@ -19629,8 +19663,8 @@
         <w:t xml:space="preserve">A status can change in play: a Non-registered vigilante caught by ExLAW may be offered Reserve status, or a cell. Losing Reserve status means losing the Director’s protection of your identity.</w:t>
       </w:r>
     </w:p>
-    <w:bookmarkEnd w:id="88"/>
-    <w:bookmarkStart w:id="89" w:name="the-rasters"/>
+    <w:bookmarkEnd w:id="89"/>
+    <w:bookmarkStart w:id="90" w:name="the-rasters"/>
     <w:p>
       <w:pPr>
         <w:pStyle w:val="Heading2"/>
@@ -19721,9 +19755,9 @@
         <w:t xml:space="preserve">(GM: Director Humbacht’s DARPA cabal runs it in a pocket dimension, as a prison and a lab: a rival to the Foundation. ExLAW doesn’t know.)</w:t>
       </w:r>
     </w:p>
-    <w:bookmarkEnd w:id="89"/>
     <w:bookmarkEnd w:id="90"/>
-    <w:bookmarkStart w:id="105" w:name="powers"/>
+    <w:bookmarkEnd w:id="91"/>
+    <w:bookmarkStart w:id="106" w:name="powers"/>
     <w:p>
       <w:pPr>
         <w:pStyle w:val="Heading1"/>
@@ -19756,7 +19790,7 @@
         <w:t xml:space="preserve">from I to VI. Player characters start at Class I to III; Classes IV to VI belong to the GM’s characters, and follow the same pattern a step further each time.</w:t>
       </w:r>
     </w:p>
-    <w:bookmarkStart w:id="91" w:name="using-powers"/>
+    <w:bookmarkStart w:id="92" w:name="using-powers"/>
     <w:p>
       <w:pPr>
         <w:pStyle w:val="Heading2"/>
@@ -20246,8 +20280,8 @@
         <w:t xml:space="preserve">A night’s sleep clears one box; a full day’s rest clears them all.</w:t>
       </w:r>
     </w:p>
-    <w:bookmarkEnd w:id="91"/>
-    <w:bookmarkStart w:id="92" w:name="powers-at-creation"/>
+    <w:bookmarkEnd w:id="92"/>
+    <w:bookmarkStart w:id="93" w:name="powers-at-creation"/>
     <w:p>
       <w:pPr>
         <w:pStyle w:val="Heading2"/>
@@ -20753,8 +20787,8 @@
         <w:t xml:space="preserve">So an Ambrosia or Mythic character can start with a Class IV power by spending their one Edge, if the GM agrees; a tier 2 Operant can trade their Edges for a stronger power or a fourth one.</w:t>
       </w:r>
     </w:p>
-    <w:bookmarkEnd w:id="92"/>
-    <w:bookmarkStart w:id="93" w:name="growing-your-powers"/>
+    <w:bookmarkEnd w:id="93"/>
+    <w:bookmarkStart w:id="94" w:name="growing-your-powers"/>
     <w:p>
       <w:pPr>
         <w:pStyle w:val="Heading2"/>
@@ -21103,8 +21137,8 @@
         <w:t xml:space="preserve">.</w:t>
       </w:r>
     </w:p>
-    <w:bookmarkEnd w:id="93"/>
-    <w:bookmarkStart w:id="94" w:name="the-powers"/>
+    <w:bookmarkEnd w:id="94"/>
+    <w:bookmarkStart w:id="95" w:name="the-powers"/>
     <w:p>
       <w:pPr>
         <w:pStyle w:val="Heading2"/>
@@ -21113,8 +21147,8 @@
         <w:t xml:space="preserve">The powers</w:t>
       </w:r>
     </w:p>
-    <w:bookmarkEnd w:id="94"/>
-    <w:bookmarkStart w:id="95" w:name="energy-and-attack"/>
+    <w:bookmarkEnd w:id="95"/>
+    <w:bookmarkStart w:id="96" w:name="energy-and-attack"/>
     <w:p>
       <w:pPr>
         <w:pStyle w:val="Heading2"/>
@@ -21804,8 +21838,8 @@
         </w:tc>
       </w:tr>
     </w:tbl>
-    <w:bookmarkEnd w:id="95"/>
-    <w:bookmarkStart w:id="96" w:name="body-and-movement"/>
+    <w:bookmarkEnd w:id="96"/>
+    <w:bookmarkStart w:id="97" w:name="body-and-movement"/>
     <w:p>
       <w:pPr>
         <w:pStyle w:val="Heading2"/>
@@ -22983,8 +23017,8 @@
         </w:tc>
       </w:tr>
     </w:tbl>
-    <w:bookmarkEnd w:id="96"/>
-    <w:bookmarkStart w:id="97" w:name="mind-and-senses"/>
+    <w:bookmarkEnd w:id="97"/>
+    <w:bookmarkStart w:id="98" w:name="mind-and-senses"/>
     <w:p>
       <w:pPr>
         <w:pStyle w:val="Heading2"/>
@@ -23892,8 +23926,8 @@
         </w:tc>
       </w:tr>
     </w:tbl>
-    <w:bookmarkEnd w:id="97"/>
-    <w:bookmarkStart w:id="98" w:name="control-and-the-strange"/>
+    <w:bookmarkEnd w:id="98"/>
+    <w:bookmarkStart w:id="99" w:name="control-and-the-strange"/>
     <w:p>
       <w:pPr>
         <w:pStyle w:val="Heading2"/>
@@ -25023,8 +25057,8 @@
         </w:tc>
       </w:tr>
     </w:tbl>
-    <w:bookmarkEnd w:id="98"/>
-    <w:bookmarkStart w:id="99" w:name="escalated-classes"/>
+    <w:bookmarkEnd w:id="99"/>
+    <w:bookmarkStart w:id="100" w:name="escalated-classes"/>
     <w:p>
       <w:pPr>
         <w:pStyle w:val="Heading2"/>
@@ -28404,8 +28438,8 @@
         </w:tc>
       </w:tr>
     </w:tbl>
-    <w:bookmarkEnd w:id="99"/>
-    <w:bookmarkStart w:id="100" w:name="leaping-and-teleporting"/>
+    <w:bookmarkEnd w:id="100"/>
+    <w:bookmarkStart w:id="101" w:name="leaping-and-teleporting"/>
     <w:p>
       <w:pPr>
         <w:pStyle w:val="Heading2"/>
@@ -28458,8 +28492,8 @@
         <w:t xml:space="preserve">one action. You can’t arrive inside solid matter. A place you’ve never been is −2 to the Powers roll. On a natural 18 you arrive off target, as the GM decides: the wrong room, the wrong street, or somewhere much worse.</w:t>
       </w:r>
     </w:p>
-    <w:bookmarkEnd w:id="100"/>
-    <w:bookmarkStart w:id="101" w:name="cantrips-1"/>
+    <w:bookmarkEnd w:id="101"/>
+    <w:bookmarkStart w:id="102" w:name="cantrips-1"/>
     <w:p>
       <w:pPr>
         <w:pStyle w:val="Heading2"/>
@@ -29583,8 +29617,8 @@
         <w:t xml:space="preserve">.</w:t>
       </w:r>
     </w:p>
-    <w:bookmarkEnd w:id="101"/>
-    <w:bookmarkStart w:id="102" w:name="rituals-1"/>
+    <w:bookmarkEnd w:id="102"/>
+    <w:bookmarkStart w:id="103" w:name="rituals-1"/>
     <w:p>
       <w:pPr>
         <w:pStyle w:val="Heading2"/>
@@ -30532,8 +30566,8 @@
         <w:t xml:space="preserve">Without fuel, a ritual fails before it begins. Fuel taken from an unwilling person works, and is exactly how the Foundation and Raster Zero do it; for player characters it’s a crime under the EPA, and a black mark on any Adept.</w:t>
       </w:r>
     </w:p>
-    <w:bookmarkEnd w:id="102"/>
-    <w:bookmarkStart w:id="103" w:name="aegis-suits"/>
+    <w:bookmarkEnd w:id="103"/>
+    <w:bookmarkStart w:id="104" w:name="aegis-suits"/>
     <w:p>
       <w:pPr>
         <w:pStyle w:val="Heading2"/>
@@ -30611,8 +30645,8 @@
         <w:t xml:space="preserve">fired with Firearms. Suiting up takes a minute. A shot at the power pack (−2 to aim) that gets through shuts the suit down until it’s repaired with Engineering. The suits belong to ExLAW, or to whoever stole one.</w:t>
       </w:r>
     </w:p>
-    <w:bookmarkEnd w:id="103"/>
-    <w:bookmarkStart w:id="104" w:name="the-labs-want-you"/>
+    <w:bookmarkEnd w:id="104"/>
+    <w:bookmarkStart w:id="105" w:name="the-labs-want-you"/>
     <w:p>
       <w:pPr>
         <w:pStyle w:val="Heading2"/>
@@ -30629,9 +30663,9 @@
         <w:t xml:space="preserve">A character with a Class III power, or any (GM) power, draws interest from the Foundation and Raster Zero. That interest is a story hook, not a rule.</w:t>
       </w:r>
     </w:p>
-    <w:bookmarkEnd w:id="104"/>
     <w:bookmarkEnd w:id="105"/>
-    <w:bookmarkStart w:id="106" w:name="factions"/>
+    <w:bookmarkEnd w:id="106"/>
+    <w:bookmarkStart w:id="107" w:name="factions"/>
     <w:p>
       <w:pPr>
         <w:pStyle w:val="Heading1"/>
@@ -31083,8 +31117,8 @@
         <w:t xml:space="preserve">The dark reflection of our world, sending duplicates through the thinning walls.</w:t>
       </w:r>
     </w:p>
-    <w:bookmarkEnd w:id="106"/>
-    <w:bookmarkStart w:id="107" w:name="otherworld-and-shadow-earth"/>
+    <w:bookmarkEnd w:id="107"/>
+    <w:bookmarkStart w:id="108" w:name="otherworld-and-shadow-earth"/>
     <w:p>
       <w:pPr>
         <w:pStyle w:val="Heading1"/>
@@ -31261,8 +31295,8 @@
         <w:t xml:space="preserve">of our own people, who serve as the rulers’ minions. Since 2012 the walls have been thin, and more of them get through every year.</w:t>
       </w:r>
     </w:p>
-    <w:bookmarkEnd w:id="107"/>
-    <w:bookmarkStart w:id="108" w:name="notable-operants"/>
+    <w:bookmarkEnd w:id="108"/>
+    <w:bookmarkStart w:id="109" w:name="notable-operants"/>
     <w:p>
       <w:pPr>
         <w:pStyle w:val="Heading1"/>
@@ -31832,8 +31866,8 @@
         <w:t xml:space="preserve">Once an adjunct professor of comparative folklore in New York, obsessed with a single current of power he believed older than civilization. In a university archive he found untranslated manuscripts in a 19th-century occultist’s papers: a ritual encoded in language itself. He spoke the words aloud, and his mind opened for a few burning moments to the raw currents of Otherworld. It shattered him. He lost his job and his name, and wanders New York’s alleys and subway tunnels muttering. Yet his chalk sigils ward whole stations by accident, his ramblings predict murders and market crashes, pigeons land on his shoulders as if awaiting orders, and children sometimes see a crown of burning letters over his head. He is part prophet, part lunatic, part guardian and part danger.</w:t>
       </w:r>
     </w:p>
-    <w:bookmarkEnd w:id="108"/>
-    <w:bookmarkStart w:id="109" w:name="threats"/>
+    <w:bookmarkEnd w:id="109"/>
+    <w:bookmarkStart w:id="110" w:name="threats"/>
     <w:p>
       <w:pPr>
         <w:pStyle w:val="Heading1"/>
@@ -34071,8 +34105,8 @@
         <w:t xml:space="preserve">For a tougher version, add +1 to its targets and one box, or raise a power one Class; for a weaker one, subtract.</w:t>
       </w:r>
     </w:p>
-    <w:bookmarkEnd w:id="109"/>
-    <w:bookmarkStart w:id="117" w:name="ready-made-characters"/>
+    <w:bookmarkEnd w:id="110"/>
+    <w:bookmarkStart w:id="118" w:name="ready-made-characters"/>
     <w:p>
       <w:pPr>
         <w:pStyle w:val="Heading1"/>
@@ -34089,7 +34123,7 @@
         <w:t xml:space="preserve">Characters ready to play, for one-shots, new players, or a group in a hurry. Each follows the creation rules exactly, and their connections tie them together. In the creator, choose one from the ready-made list to open it and make it your own.</w:t>
       </w:r>
     </w:p>
-    <w:bookmarkStart w:id="110" w:name="rachel-kwan"/>
+    <w:bookmarkStart w:id="111" w:name="rachel-kwan"/>
     <w:p>
       <w:pPr>
         <w:pStyle w:val="Heading2"/>
@@ -34318,8 +34352,8 @@
         <w:t xml:space="preserve">Jess Calloway is the only reporter who asked about her missing partner. Kwan hasn’t decided whether to trust her.</w:t>
       </w:r>
     </w:p>
-    <w:bookmarkEnd w:id="110"/>
-    <w:bookmarkStart w:id="111" w:name="luis-bulldog-ortega"/>
+    <w:bookmarkEnd w:id="111"/>
+    <w:bookmarkStart w:id="112" w:name="luis-bulldog-ortega"/>
     <w:p>
       <w:pPr>
         <w:pStyle w:val="Heading2"/>
@@ -34544,8 +34578,8 @@
         <w:t xml:space="preserve">He flew cover for Rachel Kwan the night her partner vanished, and saw something he never put in the report.</w:t>
       </w:r>
     </w:p>
-    <w:bookmarkEnd w:id="111"/>
-    <w:bookmarkStart w:id="112" w:name="naomi-price"/>
+    <w:bookmarkEnd w:id="112"/>
+    <w:bookmarkStart w:id="113" w:name="naomi-price"/>
     <w:p>
       <w:pPr>
         <w:pStyle w:val="Heading2"/>
@@ -34774,8 +34808,8 @@
         <w:t xml:space="preserve">Static saved her from a Foundation snatch team on live TV, and vanished before the cameras turned.</w:t>
       </w:r>
     </w:p>
-    <w:bookmarkEnd w:id="112"/>
-    <w:bookmarkStart w:id="113" w:name="dr.-tobias-wren"/>
+    <w:bookmarkEnd w:id="113"/>
+    <w:bookmarkStart w:id="114" w:name="dr.-tobias-wren"/>
     <w:p>
       <w:pPr>
         <w:pStyle w:val="Heading2"/>
@@ -35004,8 +35038,8 @@
         <w:t xml:space="preserve">He taught Maeve Ashgrove’s handler, and was the one who recognized what Maeve really is.</w:t>
       </w:r>
     </w:p>
-    <w:bookmarkEnd w:id="113"/>
-    <w:bookmarkStart w:id="114" w:name="jess-calloway"/>
+    <w:bookmarkEnd w:id="114"/>
+    <w:bookmarkStart w:id="115" w:name="jess-calloway"/>
     <w:p>
       <w:pPr>
         <w:pStyle w:val="Heading2"/>
@@ -35234,8 +35268,8 @@
         <w:t xml:space="preserve">Rachel Kwan’s missing partner was her source. She hasn’t told Kwan yet.</w:t>
       </w:r>
     </w:p>
-    <w:bookmarkEnd w:id="114"/>
-    <w:bookmarkStart w:id="115" w:name="subject-19"/>
+    <w:bookmarkEnd w:id="115"/>
+    <w:bookmarkStart w:id="116" w:name="subject-19"/>
     <w:p>
       <w:pPr>
         <w:pStyle w:val="Heading2"/>
@@ -35485,8 +35519,8 @@
         <w:t xml:space="preserve">Saved Daybreak from a Foundation snatch team on live TV, and ran before the cameras turned.</w:t>
       </w:r>
     </w:p>
-    <w:bookmarkEnd w:id="115"/>
-    <w:bookmarkStart w:id="116" w:name="maeve-ashgrove"/>
+    <w:bookmarkEnd w:id="116"/>
+    <w:bookmarkStart w:id="117" w:name="maeve-ashgrove"/>
     <w:p>
       <w:pPr>
         <w:pStyle w:val="Heading2"/>
@@ -35715,9 +35749,9 @@
         <w:t xml:space="preserve">Dr. Tobias Wren saw through her glamour the first day. He’s kept her secret; she wonders what it’ll cost.</w:t>
       </w:r>
     </w:p>
-    <w:bookmarkEnd w:id="116"/>
     <w:bookmarkEnd w:id="117"/>
-    <w:bookmarkStart w:id="118" w:name="advantages"/>
+    <w:bookmarkEnd w:id="118"/>
+    <w:bookmarkStart w:id="119" w:name="advantages"/>
     <w:p>
       <w:pPr>
         <w:pStyle w:val="Heading1"/>
@@ -36571,8 +36605,8 @@
         <w:t xml:space="preserve">complication unless the GM agrees otherwise. Origin advantages (in each origin’s entry) are often the most flavorful choice for an Operant.</w:t>
       </w:r>
     </w:p>
-    <w:bookmarkEnd w:id="118"/>
-    <w:bookmarkStart w:id="129" w:name="origins"/>
+    <w:bookmarkEnd w:id="119"/>
+    <w:bookmarkStart w:id="130" w:name="origins"/>
     <w:p>
       <w:pPr>
         <w:pStyle w:val="Heading1"/>
@@ -37310,7 +37344,7 @@
         </w:tc>
       </w:tr>
     </w:tbl>
-    <w:bookmarkStart w:id="119" w:name="non-operant"/>
+    <w:bookmarkStart w:id="120" w:name="non-operant"/>
     <w:p>
       <w:pPr>
         <w:pStyle w:val="Heading2"/>
@@ -37659,8 +37693,8 @@
         </w:tc>
       </w:tr>
     </w:tbl>
-    <w:bookmarkEnd w:id="119"/>
-    <w:bookmarkStart w:id="120" w:name="adept"/>
+    <w:bookmarkEnd w:id="120"/>
+    <w:bookmarkStart w:id="121" w:name="adept"/>
     <w:p>
       <w:pPr>
         <w:pStyle w:val="Heading2"/>
@@ -38021,8 +38055,8 @@
         </w:tc>
       </w:tr>
     </w:tbl>
-    <w:bookmarkEnd w:id="120"/>
-    <w:bookmarkStart w:id="121" w:name="aurora-born"/>
+    <w:bookmarkEnd w:id="121"/>
+    <w:bookmarkStart w:id="122" w:name="aurora-born"/>
     <w:p>
       <w:pPr>
         <w:pStyle w:val="Heading2"/>
@@ -38371,8 +38405,8 @@
         </w:tc>
       </w:tr>
     </w:tbl>
-    <w:bookmarkEnd w:id="121"/>
-    <w:bookmarkStart w:id="122" w:name="bonded"/>
+    <w:bookmarkEnd w:id="122"/>
+    <w:bookmarkStart w:id="123" w:name="bonded"/>
     <w:p>
       <w:pPr>
         <w:pStyle w:val="Heading2"/>
@@ -38733,8 +38767,8 @@
         </w:tc>
       </w:tr>
     </w:tbl>
-    <w:bookmarkEnd w:id="122"/>
-    <w:bookmarkStart w:id="123" w:name="lab-made"/>
+    <w:bookmarkEnd w:id="123"/>
+    <w:bookmarkStart w:id="124" w:name="lab-made"/>
     <w:p>
       <w:pPr>
         <w:pStyle w:val="Heading2"/>
@@ -39083,8 +39117,8 @@
         </w:tc>
       </w:tr>
     </w:tbl>
-    <w:bookmarkEnd w:id="123"/>
-    <w:bookmarkStart w:id="124" w:name="otherworlder"/>
+    <w:bookmarkEnd w:id="124"/>
+    <w:bookmarkStart w:id="125" w:name="otherworlder"/>
     <w:p>
       <w:pPr>
         <w:pStyle w:val="Heading2"/>
@@ -39433,8 +39467,8 @@
         </w:tc>
       </w:tr>
     </w:tbl>
-    <w:bookmarkEnd w:id="124"/>
-    <w:bookmarkStart w:id="125" w:name="shadow-earth-defector"/>
+    <w:bookmarkEnd w:id="125"/>
+    <w:bookmarkStart w:id="126" w:name="shadow-earth-defector"/>
     <w:p>
       <w:pPr>
         <w:pStyle w:val="Heading2"/>
@@ -39795,8 +39829,8 @@
         </w:tc>
       </w:tr>
     </w:tbl>
-    <w:bookmarkEnd w:id="125"/>
-    <w:bookmarkStart w:id="126" w:name="touched"/>
+    <w:bookmarkEnd w:id="126"/>
+    <w:bookmarkStart w:id="127" w:name="touched"/>
     <w:p>
       <w:pPr>
         <w:pStyle w:val="Heading2"/>
@@ -40160,8 +40194,8 @@
         </w:tc>
       </w:tr>
     </w:tbl>
-    <w:bookmarkEnd w:id="126"/>
-    <w:bookmarkStart w:id="127" w:name="ambrosia"/>
+    <w:bookmarkEnd w:id="127"/>
+    <w:bookmarkStart w:id="128" w:name="ambrosia"/>
     <w:p>
       <w:pPr>
         <w:pStyle w:val="Heading2"/>
@@ -40522,8 +40556,8 @@
         </w:tc>
       </w:tr>
     </w:tbl>
-    <w:bookmarkEnd w:id="127"/>
-    <w:bookmarkStart w:id="128" w:name="mythic"/>
+    <w:bookmarkEnd w:id="128"/>
+    <w:bookmarkStart w:id="129" w:name="mythic"/>
     <w:p>
       <w:pPr>
         <w:pStyle w:val="Heading2"/>
@@ -40884,9 +40918,9 @@
         </w:tc>
       </w:tr>
     </w:tbl>
-    <w:bookmarkEnd w:id="128"/>
     <w:bookmarkEnd w:id="129"/>
-    <w:bookmarkStart w:id="140" w:name="making-your-own"/>
+    <w:bookmarkEnd w:id="130"/>
+    <w:bookmarkStart w:id="141" w:name="making-your-own"/>
     <w:p>
       <w:pPr>
         <w:pStyle w:val="Heading1"/>
@@ -40919,7 +40953,7 @@
         <w:t xml:space="preserve">option at the end of each list, and its checklist holds a custom choice to the same rules as everything else.</w:t>
       </w:r>
     </w:p>
-    <w:bookmarkStart w:id="130" w:name="a-custom-calling"/>
+    <w:bookmarkStart w:id="131" w:name="a-custom-calling"/>
     <w:p>
       <w:pPr>
         <w:pStyle w:val="Heading2"/>
@@ -41095,8 +41129,8 @@
         <w:t xml:space="preserve">.</w:t>
       </w:r>
     </w:p>
-    <w:bookmarkEnd w:id="130"/>
-    <w:bookmarkStart w:id="139" w:name="a-custom-origin"/>
+    <w:bookmarkEnd w:id="131"/>
+    <w:bookmarkStart w:id="140" w:name="a-custom-origin"/>
     <w:p>
       <w:pPr>
         <w:pStyle w:val="Heading2"/>
@@ -41113,7 +41147,7 @@
         <w:t xml:space="preserve">Build it with the GM, one step at a time.</w:t>
       </w:r>
     </w:p>
-    <w:bookmarkStart w:id="131" w:name="the-concept"/>
+    <w:bookmarkStart w:id="132" w:name="the-concept"/>
     <w:p>
       <w:pPr>
         <w:pStyle w:val="Heading3"/>
@@ -41130,8 +41164,8 @@
         <w:t xml:space="preserve">Two or three sentences: where they come from, what sets them apart, and how others see them. It should be something the origins in this book don’t already cover.</w:t>
       </w:r>
     </w:p>
-    <w:bookmarkEnd w:id="131"/>
-    <w:bookmarkStart w:id="132" w:name="the-tier"/>
+    <w:bookmarkEnd w:id="132"/>
+    <w:bookmarkStart w:id="133" w:name="the-tier"/>
     <w:p>
       <w:pPr>
         <w:pStyle w:val="Heading3"/>
@@ -41428,8 +41462,8 @@
         <w:t xml:space="preserve">When in doubt, choose the higher tier.</w:t>
       </w:r>
     </w:p>
-    <w:bookmarkEnd w:id="132"/>
-    <w:bookmarkStart w:id="133" w:name="attribute-adjustments"/>
+    <w:bookmarkEnd w:id="133"/>
+    <w:bookmarkStart w:id="134" w:name="attribute-adjustments"/>
     <w:p>
       <w:pPr>
         <w:pStyle w:val="Heading3"/>
@@ -41475,8 +41509,8 @@
         <w:t xml:space="preserve">: a +2 needs a −2 or two −1s. The adjustments move the attribute’s base (+1 starts it at 11) and raise its starting maximum (13 plus the bonus). Most origins change two to four attributes.</w:t>
       </w:r>
     </w:p>
-    <w:bookmarkEnd w:id="133"/>
-    <w:bookmarkStart w:id="134" w:name="core-rules-tier-1-and-up"/>
+    <w:bookmarkEnd w:id="134"/>
+    <w:bookmarkStart w:id="135" w:name="core-rules-tier-1-and-up"/>
     <w:p>
       <w:pPr>
         <w:pStyle w:val="Heading3"/>
@@ -41493,8 +41527,8 @@
         <w:t xml:space="preserve">One to three short rules that always apply: what they can do (see in the dark, resist cold, a free Trained skill) and what it costs (a weakness, a people’s distrust, a hazard they can’t abide). A strength with no drawback is worth more than it looks, so price it a tier higher.</w:t>
       </w:r>
     </w:p>
-    <w:bookmarkEnd w:id="134"/>
-    <w:bookmarkStart w:id="135" w:name="origin-advantages"/>
+    <w:bookmarkEnd w:id="135"/>
+    <w:bookmarkStart w:id="136" w:name="origin-advantages"/>
     <w:p>
       <w:pPr>
         <w:pStyle w:val="Heading3"/>
@@ -41549,8 +41583,8 @@
         <w:t xml:space="preserve">: a problem the trait causes, with a clear trigger and a real consequence, which earns a Spark point when it bites, like any complication. A character takes one advantage, general or origin, so make them distinct choices.</w:t>
       </w:r>
     </w:p>
-    <w:bookmarkEnd w:id="135"/>
-    <w:bookmarkStart w:id="136" w:name="an-alternate-form-optional-tier-2-or-3"/>
+    <w:bookmarkEnd w:id="136"/>
+    <w:bookmarkStart w:id="137" w:name="an-alternate-form-optional-tier-2-or-3"/>
     <w:p>
       <w:pPr>
         <w:pStyle w:val="Heading3"/>
@@ -41583,8 +41617,8 @@
         <w:t xml:space="preserve">apply.</w:t>
       </w:r>
     </w:p>
-    <w:bookmarkEnd w:id="136"/>
-    <w:bookmarkStart w:id="137" w:name="in-the-creator"/>
+    <w:bookmarkEnd w:id="137"/>
+    <w:bookmarkStart w:id="138" w:name="in-the-creator"/>
     <w:p>
       <w:pPr>
         <w:pStyle w:val="Heading3"/>
@@ -41689,8 +41723,8 @@
         <w:t xml:space="preserve">and enter the advantage and its companion complication.</w:t>
       </w:r>
     </w:p>
-    <w:bookmarkEnd w:id="137"/>
-    <w:bookmarkStart w:id="138" w:name="example"/>
+    <w:bookmarkEnd w:id="138"/>
+    <w:bookmarkStart w:id="139" w:name="example"/>
     <w:p>
       <w:pPr>
         <w:pStyle w:val="Heading3"/>
@@ -41811,10 +41845,10 @@
         <w:t xml:space="preserve">one at Class II, two at Class I.</w:t>
       </w:r>
     </w:p>
-    <w:bookmarkEnd w:id="138"/>
     <w:bookmarkEnd w:id="139"/>
     <w:bookmarkEnd w:id="140"/>
-    <w:bookmarkStart w:id="141" w:name="complications"/>
+    <w:bookmarkEnd w:id="141"/>
+    <w:bookmarkStart w:id="142" w:name="complications"/>
     <w:p>
       <w:pPr>
         <w:pStyle w:val="Heading1"/>
@@ -42519,8 +42553,8 @@
         </w:tc>
       </w:tr>
     </w:tbl>
-    <w:bookmarkEnd w:id="141"/>
-    <w:bookmarkStart w:id="143" w:name="quick-reference"/>
+    <w:bookmarkEnd w:id="142"/>
+    <w:bookmarkStart w:id="144" w:name="quick-reference"/>
     <w:p>
       <w:pPr>
         <w:pStyle w:val="Heading1"/>
@@ -42711,7 +42745,7 @@
       <w:r>
         <w:t xml:space="preserve"> </w:t>
       </w:r>
-      <w:hyperlink r:id="rId142">
+      <w:hyperlink r:id="rId143">
         <w:r>
           <w:rPr>
             <w:rStyle w:val="Hyperlink"/>
@@ -42723,7 +42757,7 @@
         <w:t xml:space="preserve">. You may share, adapt, and use it for any purpose, including commercially, as long as you give appropriate credit to the author.</w:t>
       </w:r>
     </w:p>
-    <w:bookmarkEnd w:id="143"/>
+    <w:bookmarkEnd w:id="144"/>
     <w:sectPr/>
   </w:body>
 </w:document>

</xml_diff>